<commit_message>
feat: implement backend API for response logging, add documentation automation script, and configure environment-based Prisma client with local storage support.
</commit_message>
<xml_diff>
--- a/docs/en/4_Pilot_Experiment_Report.docx
+++ b/docs/en/4_Pilot_Experiment_Report.docx
@@ -931,7 +931,7 @@
         <w:pStyle w:val="Heading2"/>
       </w:pPr>
       <w:r>
-        <w:t>6. User Segmentation for the Phase 2 Study</w:t>
+        <w:t>6. User Segmentation &amp; Advanced Mobile Telemetry for Phase 2</w:t>
       </w:r>
     </w:p>
     <w:p>
@@ -954,7 +954,7 @@
         <w:t>Cognitive Load</w:t>
       </w:r>
       <w:r>
-        <w:t>, the second phase of data collection introduces two demographic classification variables captured on onboarding:</w:t>
+        <w:t>, the second phase of data collection introduces granular demographic classification variables captured on onboarding and a custom mobile telemetry engine:</w:t>
       </w:r>
     </w:p>
     <w:p>
@@ -1004,7 +1004,7 @@
         <w:pStyle w:val="ListBullet"/>
       </w:pPr>
       <w:r>
-        <w:t xml:space="preserve">  *Research Hypothesis*: IT students will exhibit higher skepticism towards algorithmic suggestions, resulting in lower automation bias compared to Business/Economics and Other students due to their technical understanding of the black-box model.</w:t>
+        <w:t xml:space="preserve">  *Research Hypothesis*: IT students will exhibit higher skepticism towards algorithmic suggestions, resulting in lower automation bias due to their technical understanding of the black-box model.</w:t>
       </w:r>
     </w:p>
     <w:p>
@@ -1060,10 +1060,193 @@
     </w:p>
     <w:p>
       <w:pPr>
+        <w:pStyle w:val="ListNumber"/>
+      </w:pPr>
+      <w:r/>
+      <w:r>
+        <w:rPr>
+          <w:b/>
+        </w:rPr>
+        <w:t>Participant's Age Group</w:t>
+      </w:r>
+      <w:r>
+        <w:t xml:space="preserve">: Categorizing subjects into 5 brackets: </w:t>
+      </w:r>
+      <w:r>
+        <w:rPr>
+          <w:b/>
+        </w:rPr>
+        <w:t>Under 18</w:t>
+      </w:r>
+      <w:r>
+        <w:t xml:space="preserve">, </w:t>
+      </w:r>
+      <w:r>
+        <w:rPr>
+          <w:b/>
+        </w:rPr>
+        <w:t>18-22 (Students)</w:t>
+      </w:r>
+      <w:r>
+        <w:t xml:space="preserve">, </w:t>
+      </w:r>
+      <w:r>
+        <w:rPr>
+          <w:b/>
+        </w:rPr>
+        <w:t>23-30 (Young professionals)</w:t>
+      </w:r>
+      <w:r>
+        <w:t xml:space="preserve">, </w:t>
+      </w:r>
+      <w:r>
+        <w:rPr>
+          <w:b/>
+        </w:rPr>
+        <w:t>31-45 (Mid-career)</w:t>
+      </w:r>
+      <w:r>
+        <w:t xml:space="preserve">, and </w:t>
+      </w:r>
+      <w:r>
+        <w:rPr>
+          <w:b/>
+        </w:rPr>
+        <w:t>Above 45</w:t>
+      </w:r>
+      <w:r>
+        <w:t>.</w:t>
+      </w:r>
+    </w:p>
+    <w:p>
+      <w:pPr>
         <w:pStyle w:val="ListBullet"/>
       </w:pPr>
       <w:r>
-        <w:t xml:space="preserve">  *Research Hypothesis*: Users with high AI exposure will demonstrate higher fluency when interacting with the conversational AI explainer and record shorter reading times for XAI charts.</w:t>
+        <w:t xml:space="preserve">  *Research Hypothesis*: Age-based groups will capture generational variance in algorithm trust. Younger digital natives are expected to adapt quicker to XAI charts and seek deeper chatbot explanation details.</w:t>
+      </w:r>
+    </w:p>
+    <w:p>
+      <w:pPr>
+        <w:pStyle w:val="ListNumber"/>
+      </w:pPr>
+      <w:r/>
+      <w:r>
+        <w:rPr>
+          <w:b/>
+        </w:rPr>
+        <w:t>Device Type &amp; Warning Banner</w:t>
+      </w:r>
+      <w:r>
+        <w:t>:</w:t>
+      </w:r>
+    </w:p>
+    <w:p>
+      <w:pPr>
+        <w:pStyle w:val="ListBullet"/>
+      </w:pPr>
+      <w:r>
+        <w:t xml:space="preserve">  Automatically record the client device: </w:t>
+      </w:r>
+      <w:r>
+        <w:rPr>
+          <w:b/>
+        </w:rPr>
+        <w:t>Desktop</w:t>
+      </w:r>
+      <w:r>
+        <w:t xml:space="preserve">, </w:t>
+      </w:r>
+      <w:r>
+        <w:rPr>
+          <w:b/>
+        </w:rPr>
+        <w:t>Mobile</w:t>
+      </w:r>
+      <w:r>
+        <w:t xml:space="preserve">, or </w:t>
+      </w:r>
+      <w:r>
+        <w:rPr>
+          <w:b/>
+        </w:rPr>
+        <w:t>Tablet</w:t>
+      </w:r>
+      <w:r>
+        <w:t>.</w:t>
+      </w:r>
+    </w:p>
+    <w:p>
+      <w:pPr>
+        <w:pStyle w:val="ListBullet"/>
+      </w:pPr>
+      <w:r>
+        <w:t xml:space="preserve">  Present a prominent suggestion banner to mobile/tablet users to switch to a computer to ensure clean hover metric capture.</w:t>
+      </w:r>
+    </w:p>
+    <w:p>
+      <w:pPr>
+        <w:pStyle w:val="ListNumber"/>
+      </w:pPr>
+      <w:r/>
+      <w:r>
+        <w:rPr>
+          <w:b/>
+        </w:rPr>
+        <w:t>Advanced Mobile Telemetry Subsystem</w:t>
+      </w:r>
+      <w:r>
+        <w:t>:</w:t>
+      </w:r>
+    </w:p>
+    <w:p>
+      <w:pPr>
+        <w:pStyle w:val="ListBullet"/>
+      </w:pPr>
+      <w:r>
+        <w:t xml:space="preserve">  *Visibility Adjusted Time*: Utilizes the </w:t>
+      </w:r>
+      <w:r>
+        <w:rPr>
+          <w:b/>
+        </w:rPr>
+        <w:t>Page Visibility API</w:t>
+      </w:r>
+      <w:r>
+        <w:t xml:space="preserve"> to track tab out-of-focus segments (app-switching, screen lock) and subtracts it from `time_spent_seconds` to deliver clean response times.</w:t>
+      </w:r>
+    </w:p>
+    <w:p>
+      <w:pPr>
+        <w:pStyle w:val="ListBullet"/>
+      </w:pPr>
+      <w:r>
+        <w:t xml:space="preserve">  *Viewport Dwell Time (XAI Card)*: Employs the </w:t>
+      </w:r>
+      <w:r>
+        <w:rPr>
+          <w:b/>
+        </w:rPr>
+        <w:t>Intersection Observer API</w:t>
+      </w:r>
+      <w:r>
+        <w:t xml:space="preserve"> to calculate how long the explanation element was visible in the active viewport, replacing hover metrics for mobile.</w:t>
+      </w:r>
+    </w:p>
+    <w:p>
+      <w:pPr>
+        <w:pStyle w:val="ListBullet"/>
+      </w:pPr>
+      <w:r>
+        <w:t xml:space="preserve">  *Scroll Dynamics*: Logs peak scroll depth (%) and scroll direction changes to model context comparisons.</w:t>
+      </w:r>
+    </w:p>
+    <w:p>
+      <w:pPr>
+        <w:pStyle w:val="ListBullet"/>
+      </w:pPr>
+      <w:r>
+        <w:t xml:space="preserve">  *Touch Dynamics*: Measures click/tap holding durations (hesitation) and rage taps (user frustration/impatience).</w:t>
       </w:r>
     </w:p>
     <w:p>

</xml_diff>